<commit_message>
Refactor daily brief pick saving logic for improved AVOID entry management
- Enhanced the save_brief_picks function to better handle AVOID entries, ensuring accurate recording without affecting betting strategies.
- Improved internal functions for clearer extraction of market and bet text related to AVOID entries, contributing to code maintainability.
- Further optimized database insertion logic to support comprehensive tracking of both regular picks and AVOID entries, reinforcing data integrity.
</commit_message>
<xml_diff>
--- a/docs/findings_matrix_v2_4.docx
+++ b/docs/findings_matrix_v2_4.docx
@@ -8535,15 +8535,6 @@
   </w:num>
   <w:num w:numId="3" w16cid:durableId="5863851">
     <w:abstractNumId w:val="2"/>
-    <w:lvlOverride w:ilvl="0"/>
-    <w:lvlOverride w:ilvl="1"/>
-    <w:lvlOverride w:ilvl="2"/>
-    <w:lvlOverride w:ilvl="3"/>
-    <w:lvlOverride w:ilvl="4"/>
-    <w:lvlOverride w:ilvl="5"/>
-    <w:lvlOverride w:ilvl="6"/>
-    <w:lvlOverride w:ilvl="7"/>
-    <w:lvlOverride w:ilvl="8"/>
   </w:num>
   <w:num w:numId="4" w16cid:durableId="1439451126">
     <w:abstractNumId w:val="1"/>

</xml_diff>